<commit_message>
them docs và khoi tao database
</commit_message>
<xml_diff>
--- a/docs/Hướng dẫn kéo và đẩy code từ Github.docx
+++ b/docs/Hướng dẫn kéo và đẩy code từ Github.docx
@@ -96,19 +96,7 @@
     </w:p>
     <w:p>
       <w:r>
-        <w:t>git config --global user.</w:t>
-      </w:r>
-      <w:r>
-        <w:t>email</w:t>
-      </w:r>
-      <w:r>
-        <w:t>”&lt;</w:t>
-      </w:r>
-      <w:r>
-        <w:t>email</w:t>
-      </w:r>
-      <w:r>
-        <w:t>cuaban&gt;”</w:t>
+        <w:t>git config --global user.email”&lt;emailcuaban&gt;”</w:t>
       </w:r>
       <w:r>
         <w:t xml:space="preserve"> (email đăng ký github)</w:t>
@@ -521,6 +509,14 @@
     </w:p>
     <w:p>
       <w:pPr>
+        <w:ind w:left="720"/>
+      </w:pPr>
+      <w:r>
+        <w:t>Github có thể sẽ yêu cầu đăng nhập thì mọi người bấm đăng nhập là được</w:t>
+      </w:r>
+    </w:p>
+    <w:p>
+      <w:pPr>
         <w:pStyle w:val="ListParagraph"/>
         <w:numPr>
           <w:ilvl w:val="0"/>
@@ -606,7 +602,6 @@
           <w:iCs/>
           <w:color w:val="EE0000"/>
         </w:rPr>
-        <w:lastRenderedPageBreak/>
         <w:t xml:space="preserve">Lưu ý là trước khi làm gì thì trước tiên phải mở terminal như bước 1 và dùng lệnh </w:t>
       </w:r>
       <w:r>

</xml_diff>